<commit_message>
docs: replace RC with KR notation and improve template formatting
Standardize Key Result notation (RC→KR) across initiative templates. Improve formatting: bullet-style resource lists, CLAUDE.md wording fix (context→consolidated), add section 8 to initiative template, add template version footer, fix typo Innovacion→Innovación.
</commit_message>
<xml_diff>
--- a/projects/23people/consolidated/templates/iniciativa-estrategica-template.docx
+++ b/projects/23people/consolidated/templates/iniciativa-estrategica-template.docx
@@ -2,17 +2,6 @@
 <file path=word/document.xml><?xml version="1.0" encoding="utf-8"?>
 <w:document xmlns:mc="http://schemas.openxmlformats.org/markup-compatibility/2006" xmlns:o="urn:schemas-microsoft-com:office:office" xmlns:r="http://schemas.openxmlformats.org/officeDocument/2006/relationships" xmlns:m="http://schemas.openxmlformats.org/officeDocument/2006/math" xmlns:v="urn:schemas-microsoft-com:vml" xmlns:wp="http://schemas.openxmlformats.org/drawingml/2006/wordprocessingDrawing" xmlns:w10="urn:schemas-microsoft-com:office:word" xmlns:w="http://schemas.openxmlformats.org/wordprocessingml/2006/main" xmlns:wne="http://schemas.microsoft.com/office/word/2006/wordml" xmlns:sl="http://schemas.openxmlformats.org/schemaLibrary/2006/main" xmlns:a="http://schemas.openxmlformats.org/drawingml/2006/main" xmlns:pic="http://schemas.openxmlformats.org/drawingml/2006/picture" xmlns:c="http://schemas.openxmlformats.org/drawingml/2006/chart" xmlns:lc="http://schemas.openxmlformats.org/drawingml/2006/lockedCanvas" xmlns:dgm="http://schemas.openxmlformats.org/drawingml/2006/diagram" xmlns:wps="http://schemas.microsoft.com/office/word/2010/wordprocessingShape" xmlns:wpg="http://schemas.microsoft.com/office/word/2010/wordprocessingGroup" xmlns:w14="http://schemas.microsoft.com/office/word/2010/wordml" xmlns:w15="http://schemas.microsoft.com/office/word/2012/wordml" xmlns:w16="http://schemas.microsoft.com/office/word/2018/wordml" xmlns:w16cex="http://schemas.microsoft.com/office/word/2018/wordml/cex" xmlns:w16cid="http://schemas.microsoft.com/office/word/2016/wordml/cid" xmlns="http://schemas.microsoft.com/office/tasks/2019/documenttasks" xmlns:cr="http://schemas.microsoft.com/office/comments/2020/reactions">
   <w:body>
-    <w:p>
-      <w:pPr>
-        <w:spacing w:after="0" w:before="1440" w:lineRule="auto"/>
-        <w:rPr/>
-      </w:pPr>
-      <w:r>
-        <w:rPr>
-          <w:rtl w:val="0"/>
-        </w:rPr>
-      </w:r>
-    </w:p>
     <w:p>
       <w:pPr>
         <w:pStyle w:val="Title"/>
@@ -176,9 +165,6 @@
           </w:tcPr>
           <w:p>
             <w:pPr>
-              <w:rPr/>
-            </w:pPr>
-            <w:r>
               <w:rPr>
                 <w:rFonts w:ascii="Lato" w:cs="Lato" w:eastAsia="Lato" w:hAnsi="Lato"/>
                 <w:b w:val="1"/>
@@ -186,9 +172,16 @@
                 <w:color w:val="434343"/>
                 <w:sz w:val="22"/>
                 <w:szCs w:val="22"/>
-                <w:rtl w:val="0"/>
-              </w:rPr>
-              <w:t xml:space="preserve">Año</w:t>
+              </w:rPr>
+            </w:pPr>
+            <w:r>
+              <w:rPr>
+                <w:b w:val="1"/>
+                <w:bCs w:val="1"/>
+                <w:color w:val="434343"/>
+                <w:rtl w:val="0"/>
+              </w:rPr>
+              <w:t xml:space="preserve">Objetivo(s) Estratégico(s)</w:t>
             </w:r>
             <w:r>
               <w:rPr>
@@ -206,17 +199,19 @@
           </w:tcPr>
           <w:p>
             <w:pPr>
-              <w:rPr/>
-            </w:pPr>
-            <w:r>
               <w:rPr>
                 <w:rFonts w:ascii="Lato" w:cs="Lato" w:eastAsia="Lato" w:hAnsi="Lato"/>
                 <w:color w:val="666666"/>
                 <w:sz w:val="22"/>
                 <w:szCs w:val="22"/>
-                <w:rtl w:val="0"/>
-              </w:rPr>
-              <w:t xml:space="preserve">[YYYY]</w:t>
+              </w:rPr>
+            </w:pPr>
+            <w:r>
+              <w:rPr>
+                <w:color w:val="666666"/>
+                <w:rtl w:val="0"/>
+              </w:rPr>
+              <w:t xml:space="preserve">[Objetivos estratégicos a los que contribuye]</w:t>
             </w:r>
             <w:r>
               <w:rPr>
@@ -252,7 +247,7 @@
                 <w:szCs w:val="22"/>
                 <w:rtl w:val="0"/>
               </w:rPr>
-              <w:t xml:space="preserve">Estado</w:t>
+              <w:t xml:space="preserve">Año</w:t>
             </w:r>
             <w:r>
               <w:rPr>
@@ -280,7 +275,7 @@
                 <w:szCs w:val="22"/>
                 <w:rtl w:val="0"/>
               </w:rPr>
-              <w:t xml:space="preserve">Borrador / Activa / En pausa / Completada / Cancelada</w:t>
+              <w:t xml:space="preserve">[YYYY]</w:t>
             </w:r>
             <w:r>
               <w:rPr>
@@ -316,7 +311,7 @@
                 <w:szCs w:val="22"/>
                 <w:rtl w:val="0"/>
               </w:rPr>
-              <w:t xml:space="preserve">Responsable</w:t>
+              <w:t xml:space="preserve">Estado</w:t>
             </w:r>
             <w:r>
               <w:rPr>
@@ -344,7 +339,7 @@
                 <w:szCs w:val="22"/>
                 <w:rtl w:val="0"/>
               </w:rPr>
-              <w:t xml:space="preserve">[Nombre del responsable principal]</w:t>
+              <w:t xml:space="preserve">Borrador / Activa / En pausa / Completada / Cancelada</w:t>
             </w:r>
             <w:r>
               <w:rPr>
@@ -380,7 +375,7 @@
                 <w:szCs w:val="22"/>
                 <w:rtl w:val="0"/>
               </w:rPr>
-              <w:t xml:space="preserve">Fecha de creación</w:t>
+              <w:t xml:space="preserve">Responsable</w:t>
             </w:r>
             <w:r>
               <w:rPr>
@@ -408,7 +403,7 @@
                 <w:szCs w:val="22"/>
                 <w:rtl w:val="0"/>
               </w:rPr>
-              <w:t xml:space="preserve">[YYYY-MM-DD]</w:t>
+              <w:t xml:space="preserve">[Nombre del responsable principal]</w:t>
             </w:r>
             <w:r>
               <w:rPr>
@@ -444,7 +439,7 @@
                 <w:szCs w:val="22"/>
                 <w:rtl w:val="0"/>
               </w:rPr>
-              <w:t xml:space="preserve">Última modificación</w:t>
+              <w:t xml:space="preserve">Fecha de creación</w:t>
             </w:r>
             <w:r>
               <w:rPr>
@@ -482,14 +477,147 @@
           </w:p>
         </w:tc>
       </w:tr>
+      <w:tr>
+        <w:trPr>
+          <w:cantSplit w:val="0"/>
+          <w:tblHeader w:val="0"/>
+        </w:trPr>
+        <w:tc>
+          <w:tcPr>
+            <w:tcMar>
+              <w:top w:w="80.0" w:type="dxa"/>
+              <w:bottom w:w="80.0" w:type="dxa"/>
+            </w:tcMar>
+          </w:tcPr>
+          <w:p>
+            <w:pPr>
+              <w:rPr/>
+            </w:pPr>
+            <w:r>
+              <w:rPr>
+                <w:rFonts w:ascii="Lato" w:cs="Lato" w:eastAsia="Lato" w:hAnsi="Lato"/>
+                <w:b w:val="1"/>
+                <w:bCs w:val="1"/>
+                <w:color w:val="434343"/>
+                <w:sz w:val="22"/>
+                <w:szCs w:val="22"/>
+                <w:rtl w:val="0"/>
+              </w:rPr>
+              <w:t xml:space="preserve">Última modificación</w:t>
+            </w:r>
+            <w:r>
+              <w:rPr>
+                <w:rtl w:val="0"/>
+              </w:rPr>
+            </w:r>
+          </w:p>
+        </w:tc>
+        <w:tc>
+          <w:tcPr>
+            <w:tcMar>
+              <w:top w:w="80.0" w:type="dxa"/>
+              <w:bottom w:w="80.0" w:type="dxa"/>
+            </w:tcMar>
+          </w:tcPr>
+          <w:p>
+            <w:pPr>
+              <w:rPr>
+                <w:color w:val="666666"/>
+              </w:rPr>
+            </w:pPr>
+            <w:r>
+              <w:rPr>
+                <w:rFonts w:ascii="Lato" w:cs="Lato" w:eastAsia="Lato" w:hAnsi="Lato"/>
+                <w:color w:val="666666"/>
+                <w:sz w:val="22"/>
+                <w:szCs w:val="22"/>
+                <w:rtl w:val="0"/>
+              </w:rPr>
+              <w:t xml:space="preserve">[YYYY-MM-DD]</w:t>
+            </w:r>
+            <w:r>
+              <w:rPr>
+                <w:rtl w:val="0"/>
+              </w:rPr>
+            </w:r>
+          </w:p>
+        </w:tc>
+      </w:tr>
+      <w:tr>
+        <w:trPr>
+          <w:cantSplit w:val="0"/>
+          <w:tblHeader w:val="0"/>
+        </w:trPr>
+        <w:tc>
+          <w:tcPr>
+            <w:tcMar>
+              <w:top w:w="80.0" w:type="dxa"/>
+              <w:bottom w:w="80.0" w:type="dxa"/>
+            </w:tcMar>
+          </w:tcPr>
+          <w:p>
+            <w:pPr>
+              <w:rPr>
+                <w:rFonts w:ascii="Lato" w:cs="Lato" w:eastAsia="Lato" w:hAnsi="Lato"/>
+                <w:b w:val="1"/>
+                <w:bCs w:val="1"/>
+                <w:color w:val="434343"/>
+                <w:sz w:val="22"/>
+                <w:szCs w:val="22"/>
+              </w:rPr>
+            </w:pPr>
+            <w:r>
+              <w:rPr>
+                <w:b w:val="1"/>
+                <w:bCs w:val="1"/>
+                <w:color w:val="434343"/>
+                <w:rtl w:val="0"/>
+              </w:rPr>
+              <w:t xml:space="preserve">Tarjeta Kanban</w:t>
+            </w:r>
+            <w:r>
+              <w:rPr>
+                <w:rtl w:val="0"/>
+              </w:rPr>
+            </w:r>
+          </w:p>
+        </w:tc>
+        <w:tc>
+          <w:tcPr>
+            <w:tcMar>
+              <w:top w:w="80.0" w:type="dxa"/>
+              <w:bottom w:w="80.0" w:type="dxa"/>
+            </w:tcMar>
+          </w:tcPr>
+          <w:p>
+            <w:pPr>
+              <w:rPr>
+                <w:rFonts w:ascii="Lato" w:cs="Lato" w:eastAsia="Lato" w:hAnsi="Lato"/>
+                <w:color w:val="666666"/>
+                <w:sz w:val="22"/>
+                <w:szCs w:val="22"/>
+              </w:rPr>
+            </w:pPr>
+            <w:r>
+              <w:rPr>
+                <w:color w:val="666666"/>
+                <w:rtl w:val="0"/>
+              </w:rPr>
+              <w:t xml:space="preserve">[Enlace a tarjeta Kanban]</w:t>
+            </w:r>
+            <w:r>
+              <w:rPr>
+                <w:rtl w:val="0"/>
+              </w:rPr>
+            </w:r>
+          </w:p>
+        </w:tc>
+      </w:tr>
     </w:tbl>
     <w:p>
       <w:pPr>
         <w:rPr/>
       </w:pPr>
-      <w:r>
-        <w:br w:type="page"/>
-      </w:r>
       <w:r>
         <w:rPr>
           <w:rtl w:val="0"/>
@@ -501,16 +629,1087 @@
         <w:pStyle w:val="Heading2"/>
         <w:rPr/>
       </w:pPr>
+      <w:bookmarkStart w:colFirst="0" w:colLast="0" w:name="_ytu02ik3r2q0" w:id="0"/>
+      <w:bookmarkEnd w:id="0"/>
+      <w:r>
+        <w:rPr>
+          <w:rtl w:val="0"/>
+        </w:rPr>
+        <w:t xml:space="preserve">Resumen</w:t>
+      </w:r>
+    </w:p>
+    <w:p>
+      <w:pPr>
+        <w:rPr/>
+      </w:pPr>
+      <w:r>
+        <w:rPr>
+          <w:rtl w:val="0"/>
+        </w:rPr>
+      </w:r>
+    </w:p>
+    <w:p>
+      <w:pPr>
+        <w:rPr>
+          <w:b w:val="1"/>
+          <w:bCs w:val="1"/>
+        </w:rPr>
+      </w:pPr>
+      <w:r>
+        <w:rPr>
+          <w:b w:val="1"/>
+          <w:bCs w:val="1"/>
+          <w:rtl w:val="0"/>
+        </w:rPr>
+        <w:t xml:space="preserve">AI summary</w:t>
+      </w:r>
+    </w:p>
+    <w:p>
+      <w:pPr>
+        <w:rPr>
+          <w:vertAlign w:val="baseline"/>
+        </w:rPr>
+      </w:pPr>
+      <w:r>
+        <w:rPr>
+          <w:vertAlign w:val="baseline"/>
+          <w:rtl w:val="0"/>
+        </w:rPr>
+        <w:t xml:space="preserve">Este documento es una plantilla de Iniciativa Estratégica y tiene como objetivo estructurar y dar seguimiento a una iniciativa dentro de una organización.</w:t>
+      </w:r>
+      <w:r>
+        <w:rPr>
+          <w:rtl w:val="0"/>
+        </w:rPr>
+      </w:r>
+    </w:p>
+    <w:p>
+      <w:pPr>
+        <w:rPr>
+          <w:vertAlign w:val="baseline"/>
+        </w:rPr>
+      </w:pPr>
+      <w:r>
+        <w:rPr>
+          <w:rtl w:val="0"/>
+        </w:rPr>
+      </w:r>
+    </w:p>
+    <w:p>
+      <w:pPr>
+        <w:rPr>
+          <w:vertAlign w:val="baseline"/>
+        </w:rPr>
+      </w:pPr>
+      <w:r>
+        <w:rPr>
+          <w:vertAlign w:val="baseline"/>
+          <w:rtl w:val="0"/>
+        </w:rPr>
+        <w:t xml:space="preserve">Incluye las siguientes secciones clave:</w:t>
+      </w:r>
+      <w:r>
+        <w:rPr>
+          <w:rtl w:val="0"/>
+        </w:rPr>
+      </w:r>
+    </w:p>
+    <w:p>
+      <w:pPr>
+        <w:numPr>
+          <w:ilvl w:val="0"/>
+          <w:numId w:val="1"/>
+        </w:numPr>
+        <w:ind w:left="720" w:hanging="360"/>
+      </w:pPr>
+      <w:r>
+        <w:rPr>
+          <w:vertAlign w:val="baseline"/>
+          <w:rtl w:val="0"/>
+        </w:rPr>
+        <w:t xml:space="preserve">Información General: Nombre, descripción breve, elección estratégica a la que pertenece, año, estado, responsable y fechas.</w:t>
+      </w:r>
+      <w:r>
+        <w:rPr>
+          <w:rtl w:val="0"/>
+        </w:rPr>
+      </w:r>
+    </w:p>
+    <w:p>
+      <w:pPr>
+        <w:numPr>
+          <w:ilvl w:val="0"/>
+          <w:numId w:val="1"/>
+        </w:numPr>
+        <w:ind w:left="720" w:hanging="360"/>
+      </w:pPr>
+      <w:r>
+        <w:rPr>
+          <w:vertAlign w:val="baseline"/>
+          <w:rtl w:val="0"/>
+        </w:rPr>
+        <w:t xml:space="preserve">Resumen</w:t>
+      </w:r>
+      <w:r>
+        <w:rPr>
+          <w:rtl w:val="0"/>
+        </w:rPr>
+      </w:r>
+    </w:p>
+    <w:p>
+      <w:pPr>
+        <w:numPr>
+          <w:ilvl w:val="0"/>
+          <w:numId w:val="1"/>
+        </w:numPr>
+        <w:ind w:left="720" w:hanging="360"/>
+      </w:pPr>
+      <w:r>
+        <w:rPr>
+          <w:vertAlign w:val="baseline"/>
+          <w:rtl w:val="0"/>
+        </w:rPr>
+        <w:t xml:space="preserve">OKR de la Iniciativa: Objetivo y resultados clave esperados.</w:t>
+      </w:r>
+      <w:r>
+        <w:rPr>
+          <w:rtl w:val="0"/>
+        </w:rPr>
+      </w:r>
+    </w:p>
+    <w:p>
+      <w:pPr>
+        <w:numPr>
+          <w:ilvl w:val="0"/>
+          <w:numId w:val="1"/>
+        </w:numPr>
+        <w:ind w:left="720" w:hanging="360"/>
+      </w:pPr>
+      <w:r>
+        <w:rPr>
+          <w:vertAlign w:val="baseline"/>
+          <w:rtl w:val="0"/>
+        </w:rPr>
+        <w:t xml:space="preserve">Contexto y Justificación: Problema, brecha u oportunidad que aborda.</w:t>
+      </w:r>
+      <w:r>
+        <w:rPr>
+          <w:rtl w:val="0"/>
+        </w:rPr>
+      </w:r>
+    </w:p>
+    <w:p>
+      <w:pPr>
+        <w:numPr>
+          <w:ilvl w:val="0"/>
+          <w:numId w:val="1"/>
+        </w:numPr>
+        <w:ind w:left="720" w:hanging="360"/>
+      </w:pPr>
+      <w:r>
+        <w:rPr>
+          <w:vertAlign w:val="baseline"/>
+          <w:rtl w:val="0"/>
+        </w:rPr>
+        <w:t xml:space="preserve">Alcance: Lo que incluye y lo que no incluye.</w:t>
+      </w:r>
+      <w:r>
+        <w:rPr>
+          <w:rtl w:val="0"/>
+        </w:rPr>
+      </w:r>
+    </w:p>
+    <w:p>
+      <w:pPr>
+        <w:numPr>
+          <w:ilvl w:val="0"/>
+          <w:numId w:val="1"/>
+        </w:numPr>
+        <w:ind w:left="720" w:hanging="360"/>
+      </w:pPr>
+      <w:r>
+        <w:rPr>
+          <w:vertAlign w:val="baseline"/>
+          <w:rtl w:val="0"/>
+        </w:rPr>
+        <w:t xml:space="preserve">Plan de Ejecución: Líneas de acción y actividades (con Dueño, fecha límite, contribución y dependencias).</w:t>
+      </w:r>
+      <w:r>
+        <w:rPr>
+          <w:rtl w:val="0"/>
+        </w:rPr>
+      </w:r>
+    </w:p>
+    <w:p>
+      <w:pPr>
+        <w:numPr>
+          <w:ilvl w:val="0"/>
+          <w:numId w:val="1"/>
+        </w:numPr>
+        <w:ind w:left="720" w:hanging="360"/>
+      </w:pPr>
+      <w:r>
+        <w:rPr>
+          <w:vertAlign w:val="baseline"/>
+          <w:rtl w:val="0"/>
+        </w:rPr>
+        <w:t xml:space="preserve">Dependencias: Elementos que deben ocurrir primero o en paralelo.</w:t>
+      </w:r>
+      <w:r>
+        <w:rPr>
+          <w:rtl w:val="0"/>
+        </w:rPr>
+      </w:r>
+    </w:p>
+    <w:p>
+      <w:pPr>
+        <w:numPr>
+          <w:ilvl w:val="0"/>
+          <w:numId w:val="1"/>
+        </w:numPr>
+        <w:ind w:left="720" w:hanging="360"/>
+      </w:pPr>
+      <w:r>
+        <w:rPr>
+          <w:vertAlign w:val="baseline"/>
+          <w:rtl w:val="0"/>
+        </w:rPr>
+        <w:t xml:space="preserve">Recursos Necesarios: Equipo, presupuesto estimado y herramientas/capacidades requeridas.</w:t>
+      </w:r>
+      <w:r>
+        <w:rPr>
+          <w:rtl w:val="0"/>
+        </w:rPr>
+      </w:r>
+    </w:p>
+    <w:p>
+      <w:pPr>
+        <w:numPr>
+          <w:ilvl w:val="0"/>
+          <w:numId w:val="1"/>
+        </w:numPr>
+        <w:ind w:left="720" w:hanging="360"/>
+      </w:pPr>
+      <w:r>
+        <w:rPr>
+          <w:vertAlign w:val="baseline"/>
+          <w:rtl w:val="0"/>
+        </w:rPr>
+        <w:t xml:space="preserve">Riesgos Principales: Identificación, probabilidad, impacto y mitigación de los riesgos.</w:t>
+      </w:r>
+      <w:r>
+        <w:rPr>
+          <w:rtl w:val="0"/>
+        </w:rPr>
+      </w:r>
+    </w:p>
+    <w:p>
+      <w:pPr>
+        <w:rPr/>
+      </w:pPr>
+      <w:r>
+        <w:br w:type="page"/>
+      </w:r>
+      <w:r>
+        <w:rPr>
+          <w:rtl w:val="0"/>
+        </w:rPr>
+      </w:r>
+    </w:p>
+    <w:p>
+      <w:pPr>
+        <w:pStyle w:val="Heading2"/>
+        <w:rPr/>
+      </w:pPr>
+      <w:bookmarkStart w:colFirst="0" w:colLast="0" w:name="_ugwy34o1fu8a" w:id="1"/>
+      <w:bookmarkEnd w:id="1"/>
+      <w:r>
+        <w:rPr>
+          <w:rtl w:val="0"/>
+        </w:rPr>
+        <w:t xml:space="preserve">Tabla de Contenidos</w:t>
+      </w:r>
+    </w:p>
+    <w:p>
+      <w:pPr>
+        <w:rPr/>
+      </w:pPr>
+      <w:r>
+        <w:rPr>
+          <w:rtl w:val="0"/>
+        </w:rPr>
+      </w:r>
+    </w:p>
+    <w:sdt>
+      <w:sdtPr>
+        <w:id w:val="-552310181"/>
+        <w:docPartObj>
+          <w:docPartGallery w:val="Table of Contents"/>
+          <w:docPartUnique w:val="1"/>
+        </w:docPartObj>
+      </w:sdtPr>
+      <w:sdtContent>
+        <w:p>
+          <w:pPr>
+            <w:widowControl w:val="0"/>
+            <w:tabs>
+              <w:tab w:val="right" w:leader="none" w:pos="12000"/>
+            </w:tabs>
+            <w:spacing w:before="60" w:line="240" w:lineRule="auto"/>
+            <w:jc w:val="left"/>
+            <w:rPr>
+              <w:b w:val="1"/>
+              <w:bCs w:val="1"/>
+              <w:color w:val="000000"/>
+              <w:u w:val="none"/>
+            </w:rPr>
+          </w:pPr>
+          <w:r>
+            <w:fldChar w:fldCharType="begin"/>
+            <w:instrText xml:space="preserve"> TOC \h \u \z \t "Heading 1,1,Heading 2,2,Heading 3,3,Heading 4,4,Heading 5,5,Heading 6,6,"</w:instrText>
+            <w:fldChar w:fldCharType="separate"/>
+          </w:r>
+          <w:hyperlink w:anchor="_ytu02ik3r2q0">
+            <w:r>
+              <w:rPr>
+                <w:rFonts w:ascii="Lato" w:cs="Lato" w:eastAsia="Lato" w:hAnsi="Lato"/>
+                <w:b w:val="1"/>
+                <w:bCs w:val="1"/>
+                <w:i w:val="0"/>
+                <w:iCs w:val="0"/>
+                <w:smallCaps w:val="0"/>
+                <w:strike w:val="0"/>
+                <w:color w:val="000000"/>
+                <w:sz w:val="22"/>
+                <w:szCs w:val="22"/>
+                <w:u w:val="none"/>
+                <w:shd w:fill="auto" w:val="clear"/>
+                <w:vertAlign w:val="baseline"/>
+                <w:rtl w:val="0"/>
+              </w:rPr>
+              <w:t xml:space="preserve">Resumen</w:t>
+              <w:tab/>
+              <w:t xml:space="preserve">1</w:t>
+            </w:r>
+          </w:hyperlink>
+          <w:r>
+            <w:rPr>
+              <w:rtl w:val="0"/>
+            </w:rPr>
+          </w:r>
+        </w:p>
+        <w:p>
+          <w:pPr>
+            <w:widowControl w:val="0"/>
+            <w:tabs>
+              <w:tab w:val="right" w:leader="none" w:pos="12000"/>
+            </w:tabs>
+            <w:spacing w:before="60" w:line="240" w:lineRule="auto"/>
+            <w:jc w:val="left"/>
+            <w:rPr>
+              <w:b w:val="1"/>
+              <w:bCs w:val="1"/>
+              <w:color w:val="000000"/>
+              <w:u w:val="none"/>
+            </w:rPr>
+          </w:pPr>
+          <w:hyperlink w:anchor="_ugwy34o1fu8a">
+            <w:r>
+              <w:rPr>
+                <w:rFonts w:ascii="Lato" w:cs="Lato" w:eastAsia="Lato" w:hAnsi="Lato"/>
+                <w:b w:val="0"/>
+                <w:bCs w:val="0"/>
+                <w:i w:val="0"/>
+                <w:iCs w:val="0"/>
+                <w:smallCaps w:val="0"/>
+                <w:strike w:val="0"/>
+                <w:color w:val="000000"/>
+                <w:sz w:val="22"/>
+                <w:szCs w:val="22"/>
+                <w:u w:val="none"/>
+                <w:shd w:fill="auto" w:val="clear"/>
+                <w:vertAlign w:val="baseline"/>
+                <w:rtl w:val="0"/>
+              </w:rPr>
+              <w:t xml:space="preserve">Tabla de Contenidos</w:t>
+              <w:tab/>
+              <w:t xml:space="preserve">2</w:t>
+            </w:r>
+          </w:hyperlink>
+          <w:r>
+            <w:rPr>
+              <w:rtl w:val="0"/>
+            </w:rPr>
+          </w:r>
+        </w:p>
+        <w:p>
+          <w:pPr>
+            <w:widowControl w:val="0"/>
+            <w:tabs>
+              <w:tab w:val="right" w:leader="none" w:pos="12000"/>
+            </w:tabs>
+            <w:spacing w:before="60" w:line="240" w:lineRule="auto"/>
+            <w:jc w:val="left"/>
+            <w:rPr>
+              <w:b w:val="1"/>
+              <w:bCs w:val="1"/>
+              <w:color w:val="000000"/>
+              <w:u w:val="none"/>
+            </w:rPr>
+          </w:pPr>
+          <w:hyperlink w:anchor="_jszv0my58h61">
+            <w:r>
+              <w:rPr>
+                <w:rFonts w:ascii="Lato" w:cs="Lato" w:eastAsia="Lato" w:hAnsi="Lato"/>
+                <w:b w:val="1"/>
+                <w:bCs w:val="1"/>
+                <w:i w:val="0"/>
+                <w:iCs w:val="0"/>
+                <w:smallCaps w:val="0"/>
+                <w:strike w:val="0"/>
+                <w:color w:val="000000"/>
+                <w:sz w:val="22"/>
+                <w:szCs w:val="22"/>
+                <w:u w:val="none"/>
+                <w:shd w:fill="auto" w:val="clear"/>
+                <w:vertAlign w:val="baseline"/>
+                <w:rtl w:val="0"/>
+              </w:rPr>
+              <w:t xml:space="preserve">1. OKR de la Iniciativa</w:t>
+              <w:tab/>
+              <w:t xml:space="preserve">3</w:t>
+            </w:r>
+          </w:hyperlink>
+          <w:r>
+            <w:rPr>
+              <w:rtl w:val="0"/>
+            </w:rPr>
+          </w:r>
+        </w:p>
+        <w:p>
+          <w:pPr>
+            <w:widowControl w:val="0"/>
+            <w:tabs>
+              <w:tab w:val="right" w:leader="none" w:pos="12000"/>
+            </w:tabs>
+            <w:spacing w:before="60" w:line="240" w:lineRule="auto"/>
+            <w:ind w:left="360" w:firstLine="0"/>
+            <w:jc w:val="left"/>
+            <w:rPr>
+              <w:color w:val="000000"/>
+              <w:u w:val="none"/>
+            </w:rPr>
+          </w:pPr>
+          <w:hyperlink w:anchor="_k7qbvoxtbezp">
+            <w:r>
+              <w:rPr>
+                <w:rFonts w:ascii="Lato" w:cs="Lato" w:eastAsia="Lato" w:hAnsi="Lato"/>
+                <w:b w:val="0"/>
+                <w:bCs w:val="0"/>
+                <w:i w:val="0"/>
+                <w:iCs w:val="0"/>
+                <w:smallCaps w:val="0"/>
+                <w:strike w:val="0"/>
+                <w:color w:val="000000"/>
+                <w:sz w:val="22"/>
+                <w:szCs w:val="22"/>
+                <w:u w:val="none"/>
+                <w:shd w:fill="auto" w:val="clear"/>
+                <w:vertAlign w:val="baseline"/>
+                <w:rtl w:val="0"/>
+              </w:rPr>
+              <w:t xml:space="preserve">Objetivo</w:t>
+              <w:tab/>
+              <w:t xml:space="preserve">3</w:t>
+            </w:r>
+          </w:hyperlink>
+          <w:r>
+            <w:rPr>
+              <w:rtl w:val="0"/>
+            </w:rPr>
+          </w:r>
+        </w:p>
+        <w:p>
+          <w:pPr>
+            <w:widowControl w:val="0"/>
+            <w:tabs>
+              <w:tab w:val="right" w:leader="none" w:pos="12000"/>
+            </w:tabs>
+            <w:spacing w:before="60" w:line="240" w:lineRule="auto"/>
+            <w:ind w:left="360" w:firstLine="0"/>
+            <w:jc w:val="left"/>
+            <w:rPr>
+              <w:color w:val="000000"/>
+              <w:u w:val="none"/>
+            </w:rPr>
+          </w:pPr>
+          <w:hyperlink w:anchor="_e0tk5uiuvgyq">
+            <w:r>
+              <w:rPr>
+                <w:rFonts w:ascii="Lato" w:cs="Lato" w:eastAsia="Lato" w:hAnsi="Lato"/>
+                <w:b w:val="0"/>
+                <w:bCs w:val="0"/>
+                <w:i w:val="0"/>
+                <w:iCs w:val="0"/>
+                <w:smallCaps w:val="0"/>
+                <w:strike w:val="0"/>
+                <w:color w:val="000000"/>
+                <w:sz w:val="22"/>
+                <w:szCs w:val="22"/>
+                <w:u w:val="none"/>
+                <w:shd w:fill="auto" w:val="clear"/>
+                <w:vertAlign w:val="baseline"/>
+                <w:rtl w:val="0"/>
+              </w:rPr>
+              <w:t xml:space="preserve">Resultados Clave</w:t>
+              <w:tab/>
+              <w:t xml:space="preserve">3</w:t>
+            </w:r>
+          </w:hyperlink>
+          <w:r>
+            <w:rPr>
+              <w:rtl w:val="0"/>
+            </w:rPr>
+          </w:r>
+        </w:p>
+        <w:p>
+          <w:pPr>
+            <w:widowControl w:val="0"/>
+            <w:tabs>
+              <w:tab w:val="right" w:leader="none" w:pos="12000"/>
+            </w:tabs>
+            <w:spacing w:before="60" w:line="240" w:lineRule="auto"/>
+            <w:jc w:val="left"/>
+            <w:rPr>
+              <w:b w:val="1"/>
+              <w:bCs w:val="1"/>
+              <w:color w:val="000000"/>
+              <w:u w:val="none"/>
+            </w:rPr>
+          </w:pPr>
+          <w:hyperlink w:anchor="_kl6wh5sg4n3f">
+            <w:r>
+              <w:rPr>
+                <w:rFonts w:ascii="Lato" w:cs="Lato" w:eastAsia="Lato" w:hAnsi="Lato"/>
+                <w:b w:val="1"/>
+                <w:bCs w:val="1"/>
+                <w:i w:val="0"/>
+                <w:iCs w:val="0"/>
+                <w:smallCaps w:val="0"/>
+                <w:strike w:val="0"/>
+                <w:color w:val="000000"/>
+                <w:sz w:val="22"/>
+                <w:szCs w:val="22"/>
+                <w:u w:val="none"/>
+                <w:shd w:fill="auto" w:val="clear"/>
+                <w:vertAlign w:val="baseline"/>
+                <w:rtl w:val="0"/>
+              </w:rPr>
+              <w:t xml:space="preserve">2. Contexto y Justificación</w:t>
+              <w:tab/>
+              <w:t xml:space="preserve">4</w:t>
+            </w:r>
+          </w:hyperlink>
+          <w:r>
+            <w:rPr>
+              <w:rtl w:val="0"/>
+            </w:rPr>
+          </w:r>
+        </w:p>
+        <w:p>
+          <w:pPr>
+            <w:widowControl w:val="0"/>
+            <w:tabs>
+              <w:tab w:val="right" w:leader="none" w:pos="12000"/>
+            </w:tabs>
+            <w:spacing w:before="60" w:line="240" w:lineRule="auto"/>
+            <w:jc w:val="left"/>
+            <w:rPr>
+              <w:b w:val="1"/>
+              <w:bCs w:val="1"/>
+              <w:color w:val="000000"/>
+              <w:u w:val="none"/>
+            </w:rPr>
+          </w:pPr>
+          <w:hyperlink w:anchor="_vxbj38u8fmqj">
+            <w:r>
+              <w:rPr>
+                <w:rFonts w:ascii="Lato" w:cs="Lato" w:eastAsia="Lato" w:hAnsi="Lato"/>
+                <w:b w:val="1"/>
+                <w:bCs w:val="1"/>
+                <w:i w:val="0"/>
+                <w:iCs w:val="0"/>
+                <w:smallCaps w:val="0"/>
+                <w:strike w:val="0"/>
+                <w:color w:val="000000"/>
+                <w:sz w:val="22"/>
+                <w:szCs w:val="22"/>
+                <w:u w:val="none"/>
+                <w:shd w:fill="auto" w:val="clear"/>
+                <w:vertAlign w:val="baseline"/>
+                <w:rtl w:val="0"/>
+              </w:rPr>
+              <w:t xml:space="preserve">3. Alcance</w:t>
+              <w:tab/>
+              <w:t xml:space="preserve">5</w:t>
+            </w:r>
+          </w:hyperlink>
+          <w:r>
+            <w:rPr>
+              <w:rtl w:val="0"/>
+            </w:rPr>
+          </w:r>
+        </w:p>
+        <w:p>
+          <w:pPr>
+            <w:widowControl w:val="0"/>
+            <w:tabs>
+              <w:tab w:val="right" w:leader="none" w:pos="12000"/>
+            </w:tabs>
+            <w:spacing w:before="60" w:line="240" w:lineRule="auto"/>
+            <w:ind w:left="360" w:firstLine="0"/>
+            <w:jc w:val="left"/>
+            <w:rPr>
+              <w:color w:val="000000"/>
+              <w:u w:val="none"/>
+            </w:rPr>
+          </w:pPr>
+          <w:hyperlink w:anchor="_7o254guyoye7">
+            <w:r>
+              <w:rPr>
+                <w:rFonts w:ascii="Lato" w:cs="Lato" w:eastAsia="Lato" w:hAnsi="Lato"/>
+                <w:b w:val="0"/>
+                <w:bCs w:val="0"/>
+                <w:i w:val="0"/>
+                <w:iCs w:val="0"/>
+                <w:smallCaps w:val="0"/>
+                <w:strike w:val="0"/>
+                <w:color w:val="000000"/>
+                <w:sz w:val="22"/>
+                <w:szCs w:val="22"/>
+                <w:u w:val="none"/>
+                <w:shd w:fill="auto" w:val="clear"/>
+                <w:vertAlign w:val="baseline"/>
+                <w:rtl w:val="0"/>
+              </w:rPr>
+              <w:t xml:space="preserve">Incluye</w:t>
+              <w:tab/>
+              <w:t xml:space="preserve">5</w:t>
+            </w:r>
+          </w:hyperlink>
+          <w:r>
+            <w:rPr>
+              <w:rtl w:val="0"/>
+            </w:rPr>
+          </w:r>
+        </w:p>
+        <w:p>
+          <w:pPr>
+            <w:widowControl w:val="0"/>
+            <w:tabs>
+              <w:tab w:val="right" w:leader="none" w:pos="12000"/>
+            </w:tabs>
+            <w:spacing w:before="60" w:line="240" w:lineRule="auto"/>
+            <w:ind w:left="360" w:firstLine="0"/>
+            <w:jc w:val="left"/>
+            <w:rPr>
+              <w:color w:val="000000"/>
+              <w:u w:val="none"/>
+            </w:rPr>
+          </w:pPr>
+          <w:hyperlink w:anchor="_rpsued6r7arx">
+            <w:r>
+              <w:rPr>
+                <w:rFonts w:ascii="Lato" w:cs="Lato" w:eastAsia="Lato" w:hAnsi="Lato"/>
+                <w:b w:val="0"/>
+                <w:bCs w:val="0"/>
+                <w:i w:val="0"/>
+                <w:iCs w:val="0"/>
+                <w:smallCaps w:val="0"/>
+                <w:strike w:val="0"/>
+                <w:color w:val="000000"/>
+                <w:sz w:val="22"/>
+                <w:szCs w:val="22"/>
+                <w:u w:val="none"/>
+                <w:shd w:fill="auto" w:val="clear"/>
+                <w:vertAlign w:val="baseline"/>
+                <w:rtl w:val="0"/>
+              </w:rPr>
+              <w:t xml:space="preserve">No incluye</w:t>
+              <w:tab/>
+              <w:t xml:space="preserve">5</w:t>
+            </w:r>
+          </w:hyperlink>
+          <w:r>
+            <w:rPr>
+              <w:rtl w:val="0"/>
+            </w:rPr>
+          </w:r>
+        </w:p>
+        <w:p>
+          <w:pPr>
+            <w:widowControl w:val="0"/>
+            <w:tabs>
+              <w:tab w:val="right" w:leader="none" w:pos="12000"/>
+            </w:tabs>
+            <w:spacing w:before="60" w:line="240" w:lineRule="auto"/>
+            <w:jc w:val="left"/>
+            <w:rPr>
+              <w:b w:val="1"/>
+              <w:bCs w:val="1"/>
+              <w:color w:val="000000"/>
+              <w:u w:val="none"/>
+            </w:rPr>
+          </w:pPr>
+          <w:hyperlink w:anchor="_gh0bdanboew9">
+            <w:r>
+              <w:rPr>
+                <w:rFonts w:ascii="Lato" w:cs="Lato" w:eastAsia="Lato" w:hAnsi="Lato"/>
+                <w:b w:val="1"/>
+                <w:bCs w:val="1"/>
+                <w:i w:val="0"/>
+                <w:iCs w:val="0"/>
+                <w:smallCaps w:val="0"/>
+                <w:strike w:val="0"/>
+                <w:color w:val="000000"/>
+                <w:sz w:val="22"/>
+                <w:szCs w:val="22"/>
+                <w:u w:val="none"/>
+                <w:shd w:fill="auto" w:val="clear"/>
+                <w:vertAlign w:val="baseline"/>
+                <w:rtl w:val="0"/>
+              </w:rPr>
+              <w:t xml:space="preserve">4. Plan de Ejecución</w:t>
+              <w:tab/>
+              <w:t xml:space="preserve">6</w:t>
+            </w:r>
+          </w:hyperlink>
+          <w:r>
+            <w:rPr>
+              <w:rtl w:val="0"/>
+            </w:rPr>
+          </w:r>
+        </w:p>
+        <w:p>
+          <w:pPr>
+            <w:widowControl w:val="0"/>
+            <w:tabs>
+              <w:tab w:val="right" w:leader="none" w:pos="12000"/>
+            </w:tabs>
+            <w:spacing w:before="60" w:line="240" w:lineRule="auto"/>
+            <w:ind w:left="360" w:firstLine="0"/>
+            <w:jc w:val="left"/>
+            <w:rPr>
+              <w:color w:val="000000"/>
+              <w:u w:val="none"/>
+            </w:rPr>
+          </w:pPr>
+          <w:hyperlink w:anchor="_pk07mwsrzzcf">
+            <w:r>
+              <w:rPr>
+                <w:rFonts w:ascii="Lato" w:cs="Lato" w:eastAsia="Lato" w:hAnsi="Lato"/>
+                <w:b w:val="0"/>
+                <w:bCs w:val="0"/>
+                <w:i w:val="0"/>
+                <w:iCs w:val="0"/>
+                <w:smallCaps w:val="0"/>
+                <w:strike w:val="0"/>
+                <w:color w:val="000000"/>
+                <w:sz w:val="22"/>
+                <w:szCs w:val="22"/>
+                <w:u w:val="none"/>
+                <w:shd w:fill="auto" w:val="clear"/>
+                <w:vertAlign w:val="baseline"/>
+                <w:rtl w:val="0"/>
+              </w:rPr>
+              <w:t xml:space="preserve">Líneas de acción definidas</w:t>
+              <w:tab/>
+              <w:t xml:space="preserve">6</w:t>
+            </w:r>
+          </w:hyperlink>
+          <w:r>
+            <w:rPr>
+              <w:rtl w:val="0"/>
+            </w:rPr>
+          </w:r>
+        </w:p>
+        <w:p>
+          <w:pPr>
+            <w:widowControl w:val="0"/>
+            <w:tabs>
+              <w:tab w:val="right" w:leader="none" w:pos="12000"/>
+            </w:tabs>
+            <w:spacing w:before="60" w:line="240" w:lineRule="auto"/>
+            <w:ind w:left="360" w:firstLine="0"/>
+            <w:jc w:val="left"/>
+            <w:rPr>
+              <w:color w:val="000000"/>
+              <w:u w:val="none"/>
+            </w:rPr>
+          </w:pPr>
+          <w:hyperlink w:anchor="_hyffbpmmbsjb">
+            <w:r>
+              <w:rPr>
+                <w:rFonts w:ascii="Lato" w:cs="Lato" w:eastAsia="Lato" w:hAnsi="Lato"/>
+                <w:b w:val="0"/>
+                <w:bCs w:val="0"/>
+                <w:i w:val="0"/>
+                <w:iCs w:val="0"/>
+                <w:smallCaps w:val="0"/>
+                <w:strike w:val="0"/>
+                <w:color w:val="000000"/>
+                <w:sz w:val="22"/>
+                <w:szCs w:val="22"/>
+                <w:u w:val="none"/>
+                <w:shd w:fill="auto" w:val="clear"/>
+                <w:vertAlign w:val="baseline"/>
+                <w:rtl w:val="0"/>
+              </w:rPr>
+              <w:t xml:space="preserve">Actividades</w:t>
+              <w:tab/>
+              <w:t xml:space="preserve">6</w:t>
+            </w:r>
+          </w:hyperlink>
+          <w:r>
+            <w:rPr>
+              <w:rtl w:val="0"/>
+            </w:rPr>
+          </w:r>
+        </w:p>
+        <w:p>
+          <w:pPr>
+            <w:widowControl w:val="0"/>
+            <w:tabs>
+              <w:tab w:val="right" w:leader="none" w:pos="12000"/>
+            </w:tabs>
+            <w:spacing w:before="60" w:line="240" w:lineRule="auto"/>
+            <w:jc w:val="left"/>
+            <w:rPr>
+              <w:b w:val="1"/>
+              <w:bCs w:val="1"/>
+              <w:color w:val="000000"/>
+              <w:u w:val="none"/>
+            </w:rPr>
+          </w:pPr>
+          <w:hyperlink w:anchor="_68hjykgsjmj1">
+            <w:r>
+              <w:rPr>
+                <w:b w:val="1"/>
+                <w:bCs w:val="1"/>
+                <w:color w:val="000000"/>
+                <w:u w:val="none"/>
+                <w:rtl w:val="0"/>
+              </w:rPr>
+              <w:t xml:space="preserve">5. Dependencias</w:t>
+              <w:tab/>
+              <w:t xml:space="preserve">7</w:t>
+            </w:r>
+          </w:hyperlink>
+          <w:r>
+            <w:rPr>
+              <w:rtl w:val="0"/>
+            </w:rPr>
+          </w:r>
+        </w:p>
+        <w:p>
+          <w:pPr>
+            <w:widowControl w:val="0"/>
+            <w:tabs>
+              <w:tab w:val="right" w:leader="none" w:pos="12000"/>
+            </w:tabs>
+            <w:spacing w:before="60" w:line="240" w:lineRule="auto"/>
+            <w:jc w:val="left"/>
+            <w:rPr>
+              <w:b w:val="1"/>
+              <w:bCs w:val="1"/>
+              <w:color w:val="000000"/>
+              <w:u w:val="none"/>
+            </w:rPr>
+          </w:pPr>
+          <w:hyperlink w:anchor="_enienbf29eht">
+            <w:r>
+              <w:rPr>
+                <w:b w:val="1"/>
+                <w:bCs w:val="1"/>
+                <w:color w:val="000000"/>
+                <w:u w:val="none"/>
+                <w:rtl w:val="0"/>
+              </w:rPr>
+              <w:t xml:space="preserve">6. Recursos Necesarios</w:t>
+              <w:tab/>
+              <w:t xml:space="preserve">8</w:t>
+            </w:r>
+          </w:hyperlink>
+          <w:r>
+            <w:rPr>
+              <w:rtl w:val="0"/>
+            </w:rPr>
+          </w:r>
+        </w:p>
+        <w:p>
+          <w:pPr>
+            <w:widowControl w:val="0"/>
+            <w:tabs>
+              <w:tab w:val="right" w:leader="none" w:pos="12000"/>
+            </w:tabs>
+            <w:spacing w:before="60" w:line="240" w:lineRule="auto"/>
+            <w:jc w:val="left"/>
+            <w:rPr>
+              <w:b w:val="1"/>
+              <w:bCs w:val="1"/>
+              <w:color w:val="000000"/>
+              <w:u w:val="none"/>
+            </w:rPr>
+          </w:pPr>
+          <w:hyperlink w:anchor="_jceplgq2bv9t">
+            <w:r>
+              <w:rPr>
+                <w:b w:val="1"/>
+                <w:bCs w:val="1"/>
+                <w:color w:val="000000"/>
+                <w:u w:val="none"/>
+                <w:rtl w:val="0"/>
+              </w:rPr>
+              <w:t xml:space="preserve">7. Riesgos Principales</w:t>
+              <w:tab/>
+              <w:t xml:space="preserve">9</w:t>
+            </w:r>
+          </w:hyperlink>
+          <w:r>
+            <w:rPr>
+              <w:rtl w:val="0"/>
+            </w:rPr>
+          </w:r>
+        </w:p>
+        <w:p>
+          <w:pPr>
+            <w:widowControl w:val="0"/>
+            <w:tabs>
+              <w:tab w:val="right" w:leader="none" w:pos="12000"/>
+            </w:tabs>
+            <w:spacing w:before="60" w:line="240" w:lineRule="auto"/>
+            <w:jc w:val="left"/>
+            <w:rPr>
+              <w:b w:val="1"/>
+              <w:bCs w:val="1"/>
+              <w:color w:val="000000"/>
+              <w:u w:val="none"/>
+            </w:rPr>
+          </w:pPr>
+          <w:hyperlink w:anchor="_liu9dnv3zfsr">
+            <w:r>
+              <w:rPr>
+                <w:b w:val="1"/>
+                <w:bCs w:val="1"/>
+                <w:color w:val="000000"/>
+                <w:u w:val="none"/>
+                <w:rtl w:val="0"/>
+              </w:rPr>
+              <w:t xml:space="preserve">8. Actividades de la Iniciativa</w:t>
+              <w:tab/>
+              <w:t xml:space="preserve">10</w:t>
+            </w:r>
+          </w:hyperlink>
+          <w:r>
+            <w:rPr>
+              <w:rtl w:val="0"/>
+            </w:rPr>
+          </w:r>
+        </w:p>
+        <w:p>
+          <w:pPr>
+            <w:widowControl w:val="0"/>
+            <w:tabs>
+              <w:tab w:val="right" w:leader="none" w:pos="12000"/>
+            </w:tabs>
+            <w:spacing w:before="60" w:line="240" w:lineRule="auto"/>
+            <w:ind w:left="360" w:firstLine="0"/>
+            <w:jc w:val="left"/>
+            <w:rPr>
+              <w:color w:val="000000"/>
+              <w:u w:val="none"/>
+            </w:rPr>
+          </w:pPr>
+          <w:hyperlink w:anchor="_xb086cf65e9p">
+            <w:r>
+              <w:rPr>
+                <w:color w:val="000000"/>
+                <w:u w:val="none"/>
+                <w:rtl w:val="0"/>
+              </w:rPr>
+              <w:t xml:space="preserve">Actividad #1: [Completar con nombre]</w:t>
+              <w:tab/>
+              <w:t xml:space="preserve">10</w:t>
+            </w:r>
+          </w:hyperlink>
+          <w:r>
+            <w:rPr>
+              <w:rtl w:val="0"/>
+            </w:rPr>
+          </w:r>
+        </w:p>
+        <w:p>
+          <w:pPr>
+            <w:widowControl w:val="0"/>
+            <w:tabs>
+              <w:tab w:val="right" w:leader="none" w:pos="12000"/>
+            </w:tabs>
+            <w:spacing w:before="60" w:line="240" w:lineRule="auto"/>
+            <w:ind w:left="360" w:firstLine="0"/>
+            <w:jc w:val="left"/>
+            <w:rPr>
+              <w:color w:val="000000"/>
+              <w:u w:val="none"/>
+            </w:rPr>
+          </w:pPr>
+          <w:hyperlink w:anchor="_8yb64ajtj4af">
+            <w:r>
+              <w:rPr>
+                <w:color w:val="000000"/>
+                <w:u w:val="none"/>
+                <w:rtl w:val="0"/>
+              </w:rPr>
+              <w:t xml:space="preserve">Actividad #2: [Completar con nombre]</w:t>
+              <w:tab/>
+              <w:t xml:space="preserve">10</w:t>
+            </w:r>
+          </w:hyperlink>
+          <w:r>
+            <w:rPr>
+              <w:rtl w:val="0"/>
+            </w:rPr>
+          </w:r>
+          <w:r>
+            <w:fldChar w:fldCharType="end"/>
+          </w:r>
+        </w:p>
+      </w:sdtContent>
+    </w:sdt>
+    <w:p>
+      <w:pPr>
+        <w:rPr/>
+      </w:pPr>
+      <w:r>
+        <w:br w:type="page"/>
+      </w:r>
+      <w:r>
+        <w:rPr>
+          <w:rtl w:val="0"/>
+        </w:rPr>
+      </w:r>
+    </w:p>
+    <w:p>
+      <w:pPr>
+        <w:pStyle w:val="Heading2"/>
+        <w:rPr/>
+      </w:pPr>
+      <w:bookmarkStart w:colFirst="0" w:colLast="0" w:name="_jszv0my58h61" w:id="2"/>
+      <w:bookmarkEnd w:id="2"/>
       <w:r>
         <w:rPr>
           <w:rtl w:val="0"/>
         </w:rPr>
         <w:t xml:space="preserve">1. OKR de la Iniciativa</w:t>
-      </w:r>
-      <w:r>
-        <w:rPr>
-          <w:rtl w:val="0"/>
-        </w:rPr>
       </w:r>
     </w:p>
     <w:p>
@@ -552,8 +1751,8 @@
           <w:szCs w:val="32"/>
         </w:rPr>
       </w:pPr>
-      <w:bookmarkStart w:colFirst="0" w:colLast="0" w:name="_k7qbvoxtbezp" w:id="0"/>
-      <w:bookmarkEnd w:id="0"/>
+      <w:bookmarkStart w:colFirst="0" w:colLast="0" w:name="_k7qbvoxtbezp" w:id="3"/>
+      <w:bookmarkEnd w:id="3"/>
       <w:r>
         <w:rPr>
           <w:color w:val="666666"/>
@@ -594,8 +1793,8 @@
           <w:szCs w:val="32"/>
         </w:rPr>
       </w:pPr>
-      <w:bookmarkStart w:colFirst="0" w:colLast="0" w:name="_e0tk5uiuvgyq" w:id="1"/>
-      <w:bookmarkEnd w:id="1"/>
+      <w:bookmarkStart w:colFirst="0" w:colLast="0" w:name="_e0tk5uiuvgyq" w:id="4"/>
+      <w:bookmarkEnd w:id="4"/>
       <w:r>
         <w:rPr>
           <w:color w:val="666666"/>
@@ -655,6 +1854,8 @@
         <w:pStyle w:val="Heading2"/>
         <w:rPr/>
       </w:pPr>
+      <w:bookmarkStart w:colFirst="0" w:colLast="0" w:name="_kl6wh5sg4n3f" w:id="5"/>
+      <w:bookmarkEnd w:id="5"/>
       <w:r>
         <w:rPr>
           <w:rtl w:val="0"/>
@@ -725,6 +1926,8 @@
         <w:pStyle w:val="Heading2"/>
         <w:rPr/>
       </w:pPr>
+      <w:bookmarkStart w:colFirst="0" w:colLast="0" w:name="_vxbj38u8fmqj" w:id="6"/>
+      <w:bookmarkEnd w:id="6"/>
       <w:r>
         <w:rPr>
           <w:rtl w:val="0"/>
@@ -737,6 +1940,8 @@
         <w:pStyle w:val="Heading3"/>
         <w:rPr/>
       </w:pPr>
+      <w:bookmarkStart w:colFirst="0" w:colLast="0" w:name="_7o254guyoye7" w:id="7"/>
+      <w:bookmarkEnd w:id="7"/>
       <w:r>
         <w:rPr>
           <w:rtl w:val="0"/>
@@ -748,7 +1953,7 @@
       <w:pPr>
         <w:numPr>
           <w:ilvl w:val="0"/>
-          <w:numId w:val="1"/>
+          <w:numId w:val="2"/>
         </w:numPr>
         <w:spacing w:after="80" w:before="0" w:lineRule="auto"/>
         <w:ind w:left="720" w:hanging="360"/>
@@ -774,7 +1979,7 @@
       <w:pPr>
         <w:numPr>
           <w:ilvl w:val="0"/>
-          <w:numId w:val="1"/>
+          <w:numId w:val="2"/>
         </w:numPr>
         <w:spacing w:after="80" w:before="0" w:lineRule="auto"/>
         <w:ind w:left="720" w:hanging="360"/>
@@ -801,6 +2006,8 @@
         <w:pStyle w:val="Heading3"/>
         <w:rPr/>
       </w:pPr>
+      <w:bookmarkStart w:colFirst="0" w:colLast="0" w:name="_rpsued6r7arx" w:id="8"/>
+      <w:bookmarkEnd w:id="8"/>
       <w:r>
         <w:rPr>
           <w:rtl w:val="0"/>
@@ -812,7 +2019,7 @@
       <w:pPr>
         <w:numPr>
           <w:ilvl w:val="0"/>
-          <w:numId w:val="1"/>
+          <w:numId w:val="2"/>
         </w:numPr>
         <w:spacing w:after="80" w:before="0" w:lineRule="auto"/>
         <w:ind w:left="720" w:hanging="360"/>
@@ -838,7 +2045,7 @@
       <w:pPr>
         <w:numPr>
           <w:ilvl w:val="0"/>
-          <w:numId w:val="1"/>
+          <w:numId w:val="2"/>
         </w:numPr>
         <w:spacing w:after="80" w:before="0" w:lineRule="auto"/>
         <w:ind w:left="720" w:hanging="360"/>
@@ -890,6 +2097,8 @@
         <w:pStyle w:val="Heading2"/>
         <w:rPr/>
       </w:pPr>
+      <w:bookmarkStart w:colFirst="0" w:colLast="0" w:name="_gh0bdanboew9" w:id="9"/>
+      <w:bookmarkEnd w:id="9"/>
       <w:r>
         <w:rPr>
           <w:rtl w:val="0"/>
@@ -899,67 +2108,45 @@
     </w:p>
     <w:p>
       <w:pPr>
+        <w:pStyle w:val="Heading3"/>
+        <w:spacing w:after="160" w:lineRule="auto"/>
+        <w:rPr/>
+      </w:pPr>
+      <w:bookmarkStart w:colFirst="0" w:colLast="0" w:name="_pk07mwsrzzcf" w:id="10"/>
+      <w:bookmarkEnd w:id="10"/>
+      <w:r>
+        <w:rPr>
+          <w:rtl w:val="0"/>
+        </w:rPr>
+        <w:t xml:space="preserve">Líneas de acción definidas</w:t>
+      </w:r>
+    </w:p>
+    <w:p>
+      <w:pPr>
         <w:spacing w:line="276" w:lineRule="auto"/>
-        <w:rPr>
-          <w:color w:val="000000"/>
-        </w:rPr>
-      </w:pPr>
-      <w:r>
-        <w:rPr>
-          <w:rtl w:val="0"/>
-        </w:rPr>
-      </w:r>
-    </w:p>
-    <w:p>
-      <w:pPr>
-        <w:spacing w:after="160" w:before="0" w:lineRule="auto"/>
-        <w:rPr>
-          <w:color w:val="666666"/>
-          <w:sz w:val="32"/>
-          <w:szCs w:val="32"/>
-        </w:rPr>
-      </w:pPr>
-      <w:r>
-        <w:rPr>
-          <w:color w:val="666666"/>
-          <w:sz w:val="32"/>
-          <w:szCs w:val="32"/>
-          <w:rtl w:val="0"/>
-        </w:rPr>
-        <w:t xml:space="preserve">Líneas de acción definidas</w:t>
-      </w:r>
-    </w:p>
-    <w:p>
-      <w:pPr>
-        <w:spacing w:line="276" w:lineRule="auto"/>
-        <w:rPr>
-          <w:i w:val="1"/>
-          <w:iCs w:val="1"/>
-          <w:color w:val="000000"/>
-        </w:rPr>
-      </w:pPr>
-      <w:r>
         <w:rPr>
           <w:i w:val="1"/>
           <w:iCs w:val="1"/>
           <w:color w:val="666666"/>
-          <w:rtl w:val="0"/>
-        </w:rPr>
-        <w:t xml:space="preserve">Las Líneas de Acción son agrupaciones lógicas de actividades. El estado de las actividades se gestiona en el tablero Kanban, no en este documento.</w:t>
-      </w:r>
-      <w:r>
-        <w:rPr>
-          <w:rtl w:val="0"/>
-        </w:rPr>
-      </w:r>
-    </w:p>
-    <w:p>
-      <w:pPr>
-        <w:spacing w:line="276" w:lineRule="auto"/>
+        </w:rPr>
+      </w:pPr>
+      <w:r>
         <w:rPr>
           <w:i w:val="1"/>
           <w:iCs w:val="1"/>
-          <w:color w:val="000000"/>
+          <w:color w:val="666666"/>
+          <w:rtl w:val="0"/>
+        </w:rPr>
+        <w:t xml:space="preserve">Las Líneas de Acción son agrupaciones lógicas de actividades. </w:t>
+      </w:r>
+    </w:p>
+    <w:p>
+      <w:pPr>
+        <w:spacing w:line="276" w:lineRule="auto"/>
+        <w:rPr>
+          <w:i w:val="1"/>
+          <w:iCs w:val="1"/>
+          <w:color w:val="666666"/>
         </w:rPr>
       </w:pPr>
       <w:r>
@@ -1130,30 +2317,55 @@
     <w:p>
       <w:pPr>
         <w:pStyle w:val="Heading3"/>
-        <w:spacing w:after="240" w:before="400" w:line="276" w:lineRule="auto"/>
-        <w:jc w:val="both"/>
-        <w:rPr>
+        <w:rPr/>
+      </w:pPr>
+      <w:bookmarkStart w:colFirst="0" w:colLast="0" w:name="_hyffbpmmbsjb" w:id="11"/>
+      <w:bookmarkEnd w:id="11"/>
+      <w:r>
+        <w:rPr>
+          <w:rtl w:val="0"/>
+        </w:rPr>
+        <w:t xml:space="preserve">Actividades</w:t>
+      </w:r>
+    </w:p>
+    <w:p>
+      <w:pPr>
+        <w:spacing w:line="276" w:lineRule="auto"/>
+        <w:rPr>
+          <w:i w:val="1"/>
+          <w:iCs w:val="1"/>
+          <w:color w:val="000000"/>
+        </w:rPr>
+      </w:pPr>
+      <w:r>
+        <w:rPr>
+          <w:i w:val="1"/>
+          <w:iCs w:val="1"/>
           <w:color w:val="666666"/>
-          <w:sz w:val="32"/>
-          <w:szCs w:val="32"/>
-        </w:rPr>
-      </w:pPr>
-      <w:bookmarkStart w:colFirst="0" w:colLast="0" w:name="_hyffbpmmbsjb" w:id="2"/>
-      <w:bookmarkEnd w:id="2"/>
-      <w:r>
-        <w:rPr>
-          <w:color w:val="666666"/>
-          <w:sz w:val="32"/>
-          <w:szCs w:val="32"/>
-          <w:rtl w:val="0"/>
-        </w:rPr>
-        <w:t xml:space="preserve">Actividades</w:t>
+          <w:rtl w:val="0"/>
+        </w:rPr>
+        <w:t xml:space="preserve">El estado de las actividades se gestiona en el tablero Kanban, no en este documento.</w:t>
+      </w:r>
+      <w:r>
+        <w:rPr>
+          <w:rtl w:val="0"/>
+        </w:rPr>
+      </w:r>
+    </w:p>
+    <w:p>
+      <w:pPr>
+        <w:rPr/>
+      </w:pPr>
+      <w:r>
+        <w:rPr>
+          <w:rtl w:val="0"/>
+        </w:rPr>
       </w:r>
     </w:p>
     <w:tbl>
       <w:tblPr>
         <w:tblStyle w:val="Table3"/>
-        <w:tblW w:w="9029.0" w:type="dxa"/>
+        <w:tblW w:w="8940.0" w:type="dxa"/>
         <w:jc w:val="left"/>
         <w:tblBorders>
           <w:top w:color="000000" w:space="0" w:sz="8" w:val="single"/>
@@ -1167,22 +2379,20 @@
         <w:tblLook w:val="0600"/>
       </w:tblPr>
       <w:tblGrid>
-        <w:gridCol w:w="1289.857142857143"/>
-        <w:gridCol w:w="1289.857142857143"/>
-        <w:gridCol w:w="1289.857142857143"/>
-        <w:gridCol w:w="1289.857142857143"/>
-        <w:gridCol w:w="1289.857142857143"/>
-        <w:gridCol w:w="1289.857142857143"/>
-        <w:gridCol w:w="1289.857142857143"/>
+        <w:gridCol w:w="780"/>
+        <w:gridCol w:w="1770"/>
+        <w:gridCol w:w="1545"/>
+        <w:gridCol w:w="1275"/>
+        <w:gridCol w:w="1740"/>
+        <w:gridCol w:w="1830"/>
         <w:tblGridChange w:id="0">
           <w:tblGrid>
-            <w:gridCol w:w="1289.857142857143"/>
-            <w:gridCol w:w="1289.857142857143"/>
-            <w:gridCol w:w="1289.857142857143"/>
-            <w:gridCol w:w="1289.857142857143"/>
-            <w:gridCol w:w="1289.857142857143"/>
-            <w:gridCol w:w="1289.857142857143"/>
-            <w:gridCol w:w="1289.857142857143"/>
+            <w:gridCol w:w="780"/>
+            <w:gridCol w:w="1770"/>
+            <w:gridCol w:w="1545"/>
+            <w:gridCol w:w="1275"/>
+            <w:gridCol w:w="1740"/>
+            <w:gridCol w:w="1830"/>
           </w:tblGrid>
         </w:tblGridChange>
       </w:tblGrid>
@@ -1315,38 +2525,6 @@
                 <w:color w:val="000000"/>
                 <w:rtl w:val="0"/>
               </w:rPr>
-              <w:t xml:space="preserve">Dueño</w:t>
-            </w:r>
-          </w:p>
-        </w:tc>
-        <w:tc>
-          <w:tcPr>
-            <w:shd w:fill="auto" w:val="clear"/>
-            <w:tcMar>
-              <w:top w:w="100.0" w:type="dxa"/>
-              <w:left w:w="100.0" w:type="dxa"/>
-              <w:bottom w:w="100.0" w:type="dxa"/>
-              <w:right w:w="100.0" w:type="dxa"/>
-            </w:tcMar>
-            <w:vAlign w:val="top"/>
-          </w:tcPr>
-          <w:p>
-            <w:pPr>
-              <w:spacing w:line="276" w:lineRule="auto"/>
-              <w:jc w:val="left"/>
-              <w:rPr>
-                <w:b w:val="1"/>
-                <w:bCs w:val="1"/>
-                <w:color w:val="000000"/>
-              </w:rPr>
-            </w:pPr>
-            <w:r>
-              <w:rPr>
-                <w:b w:val="1"/>
-                <w:bCs w:val="1"/>
-                <w:color w:val="000000"/>
-                <w:rtl w:val="0"/>
-              </w:rPr>
               <w:t xml:space="preserve">Fecha límite</w:t>
             </w:r>
           </w:p>
@@ -1437,8 +2615,6 @@
               <w:spacing w:line="276" w:lineRule="auto"/>
               <w:jc w:val="left"/>
               <w:rPr>
-                <w:b w:val="1"/>
-                <w:bCs w:val="1"/>
                 <w:color w:val="000000"/>
               </w:rPr>
             </w:pPr>
@@ -1465,8 +2641,6 @@
               <w:spacing w:line="276" w:lineRule="auto"/>
               <w:jc w:val="left"/>
               <w:rPr>
-                <w:b w:val="1"/>
-                <w:bCs w:val="1"/>
                 <w:color w:val="000000"/>
               </w:rPr>
             </w:pPr>
@@ -1493,8 +2667,6 @@
               <w:spacing w:line="276" w:lineRule="auto"/>
               <w:jc w:val="left"/>
               <w:rPr>
-                <w:b w:val="1"/>
-                <w:bCs w:val="1"/>
                 <w:color w:val="000000"/>
               </w:rPr>
             </w:pPr>
@@ -1521,8 +2693,6 @@
               <w:spacing w:line="276" w:lineRule="auto"/>
               <w:jc w:val="left"/>
               <w:rPr>
-                <w:b w:val="1"/>
-                <w:bCs w:val="1"/>
                 <w:color w:val="000000"/>
               </w:rPr>
             </w:pPr>
@@ -1549,15 +2719,15 @@
               <w:spacing w:line="276" w:lineRule="auto"/>
               <w:jc w:val="left"/>
               <w:rPr>
-                <w:b w:val="1"/>
-                <w:bCs w:val="1"/>
                 <w:color w:val="000000"/>
               </w:rPr>
             </w:pPr>
             <w:r>
               <w:rPr>
-                <w:rtl w:val="0"/>
-              </w:rPr>
+                <w:color w:val="000000"/>
+                <w:rtl w:val="0"/>
+              </w:rPr>
+              <w:t xml:space="preserve">[KR]</w:t>
             </w:r>
           </w:p>
         </w:tc>
@@ -1577,43 +2747,15 @@
               <w:spacing w:line="276" w:lineRule="auto"/>
               <w:jc w:val="left"/>
               <w:rPr>
-                <w:b w:val="1"/>
-                <w:bCs w:val="1"/>
                 <w:color w:val="000000"/>
               </w:rPr>
             </w:pPr>
             <w:r>
               <w:rPr>
-                <w:rtl w:val="0"/>
-              </w:rPr>
-            </w:r>
-          </w:p>
-        </w:tc>
-        <w:tc>
-          <w:tcPr>
-            <w:shd w:fill="auto" w:val="clear"/>
-            <w:tcMar>
-              <w:top w:w="100.0" w:type="dxa"/>
-              <w:left w:w="100.0" w:type="dxa"/>
-              <w:bottom w:w="100.0" w:type="dxa"/>
-              <w:right w:w="100.0" w:type="dxa"/>
-            </w:tcMar>
-            <w:vAlign w:val="top"/>
-          </w:tcPr>
-          <w:p>
-            <w:pPr>
-              <w:spacing w:line="276" w:lineRule="auto"/>
-              <w:jc w:val="left"/>
-              <w:rPr>
-                <w:b w:val="1"/>
-                <w:bCs w:val="1"/>
-                <w:color w:val="000000"/>
-              </w:rPr>
-            </w:pPr>
-            <w:r>
-              <w:rPr>
-                <w:rtl w:val="0"/>
-              </w:rPr>
+                <w:color w:val="000000"/>
+                <w:rtl w:val="0"/>
+              </w:rPr>
+              <w:t xml:space="preserve">[# Actividad]</w:t>
             </w:r>
           </w:p>
         </w:tc>
@@ -1651,11 +2793,19 @@
         <w:pStyle w:val="Heading2"/>
         <w:rPr/>
       </w:pPr>
-      <w:r>
-        <w:rPr>
-          <w:rtl w:val="0"/>
-        </w:rPr>
-        <w:t xml:space="preserve">6. Dependencias</w:t>
+      <w:bookmarkStart w:colFirst="0" w:colLast="0" w:name="_68hjykgsjmj1" w:id="12"/>
+      <w:bookmarkEnd w:id="12"/>
+      <w:r>
+        <w:rPr>
+          <w:rtl w:val="0"/>
+        </w:rPr>
+        <w:t xml:space="preserve">5</w:t>
+      </w:r>
+      <w:r>
+        <w:rPr>
+          <w:rtl w:val="0"/>
+        </w:rPr>
+        <w:t xml:space="preserve">. Dependencias</w:t>
       </w:r>
     </w:p>
     <w:p>
@@ -1819,7 +2969,16 @@
                 <w:szCs w:val="22"/>
                 <w:rtl w:val="0"/>
               </w:rPr>
-              <w:t xml:space="preserve">Iniciativa o proyecto relacionado</w:t>
+              <w:t xml:space="preserve">Iniciativa </w:t>
+            </w:r>
+            <w:r>
+              <w:rPr>
+                <w:b w:val="1"/>
+                <w:bCs w:val="1"/>
+                <w:color w:val="000000"/>
+                <w:rtl w:val="0"/>
+              </w:rPr>
+              <w:t xml:space="preserve">relacionada</w:t>
             </w:r>
             <w:r>
               <w:rPr>
@@ -1941,17 +3100,29 @@
         <w:pStyle w:val="Heading2"/>
         <w:rPr/>
       </w:pPr>
-      <w:r>
-        <w:rPr>
-          <w:rtl w:val="0"/>
-        </w:rPr>
-        <w:t xml:space="preserve">7. Recursos Necesarios</w:t>
-      </w:r>
-    </w:p>
-    <w:p>
-      <w:pPr>
-        <w:spacing w:after="80" w:before="0" w:lineRule="auto"/>
-        <w:rPr/>
+      <w:bookmarkStart w:colFirst="0" w:colLast="0" w:name="_enienbf29eht" w:id="13"/>
+      <w:bookmarkEnd w:id="13"/>
+      <w:r>
+        <w:rPr>
+          <w:rtl w:val="0"/>
+        </w:rPr>
+        <w:t xml:space="preserve">6. Recursos Necesarios</w:t>
+      </w:r>
+    </w:p>
+    <w:p>
+      <w:pPr>
+        <w:numPr>
+          <w:ilvl w:val="0"/>
+          <w:numId w:val="3"/>
+        </w:numPr>
+        <w:spacing w:after="0" w:afterAutospacing="0" w:before="0" w:lineRule="auto"/>
+        <w:ind w:left="720" w:hanging="360"/>
+        <w:rPr>
+          <w:rFonts w:ascii="Lato" w:cs="Lato" w:eastAsia="Lato" w:hAnsi="Lato"/>
+          <w:sz w:val="22"/>
+          <w:szCs w:val="22"/>
+          <w:u w:val="none"/>
+        </w:rPr>
       </w:pPr>
       <w:r>
         <w:rPr>
@@ -1983,8 +3154,18 @@
     </w:p>
     <w:p>
       <w:pPr>
-        <w:spacing w:after="80" w:before="0" w:lineRule="auto"/>
-        <w:rPr/>
+        <w:numPr>
+          <w:ilvl w:val="0"/>
+          <w:numId w:val="3"/>
+        </w:numPr>
+        <w:spacing w:after="0" w:afterAutospacing="0" w:before="0" w:lineRule="auto"/>
+        <w:ind w:left="720" w:hanging="360"/>
+        <w:rPr>
+          <w:rFonts w:ascii="Lato" w:cs="Lato" w:eastAsia="Lato" w:hAnsi="Lato"/>
+          <w:sz w:val="22"/>
+          <w:szCs w:val="22"/>
+          <w:u w:val="none"/>
+        </w:rPr>
       </w:pPr>
       <w:r>
         <w:rPr>
@@ -2016,8 +3197,18 @@
     </w:p>
     <w:p>
       <w:pPr>
+        <w:numPr>
+          <w:ilvl w:val="0"/>
+          <w:numId w:val="3"/>
+        </w:numPr>
         <w:spacing w:after="80" w:before="0" w:lineRule="auto"/>
-        <w:rPr/>
+        <w:ind w:left="720" w:hanging="360"/>
+        <w:rPr>
+          <w:rFonts w:ascii="Lato" w:cs="Lato" w:eastAsia="Lato" w:hAnsi="Lato"/>
+          <w:sz w:val="22"/>
+          <w:szCs w:val="22"/>
+          <w:u w:val="none"/>
+        </w:rPr>
       </w:pPr>
       <w:r>
         <w:rPr>
@@ -2066,11 +3257,13 @@
         <w:pStyle w:val="Heading2"/>
         <w:rPr/>
       </w:pPr>
-      <w:r>
-        <w:rPr>
-          <w:rtl w:val="0"/>
-        </w:rPr>
-        <w:t xml:space="preserve">8. Riesgos Principales</w:t>
+      <w:bookmarkStart w:colFirst="0" w:colLast="0" w:name="_jceplgq2bv9t" w:id="14"/>
+      <w:bookmarkEnd w:id="14"/>
+      <w:r>
+        <w:rPr>
+          <w:rtl w:val="0"/>
+        </w:rPr>
+        <w:t xml:space="preserve">7. Riesgos Principales</w:t>
       </w:r>
     </w:p>
     <w:p>
@@ -2451,6 +3644,83 @@
         <w:spacing w:after="0" w:before="240" w:lineRule="auto"/>
         <w:rPr/>
       </w:pPr>
+      <w:r>
+        <w:br w:type="page"/>
+      </w:r>
+      <w:r>
+        <w:rPr>
+          <w:rtl w:val="0"/>
+        </w:rPr>
+      </w:r>
+    </w:p>
+    <w:p>
+      <w:pPr>
+        <w:pStyle w:val="Heading2"/>
+        <w:spacing w:before="240" w:lineRule="auto"/>
+        <w:rPr/>
+      </w:pPr>
+      <w:bookmarkStart w:colFirst="0" w:colLast="0" w:name="_liu9dnv3zfsr" w:id="15"/>
+      <w:bookmarkEnd w:id="15"/>
+      <w:r>
+        <w:rPr>
+          <w:rtl w:val="0"/>
+        </w:rPr>
+        <w:t xml:space="preserve">8. Actividades de la Iniciativa</w:t>
+      </w:r>
+    </w:p>
+    <w:p>
+      <w:pPr>
+        <w:pStyle w:val="Heading3"/>
+        <w:spacing w:before="240" w:lineRule="auto"/>
+        <w:rPr/>
+      </w:pPr>
+      <w:bookmarkStart w:colFirst="0" w:colLast="0" w:name="_xb086cf65e9p" w:id="16"/>
+      <w:bookmarkEnd w:id="16"/>
+      <w:r>
+        <w:rPr>
+          <w:rtl w:val="0"/>
+        </w:rPr>
+        <w:t xml:space="preserve">Actividad #1: [Completar con nombre]</w:t>
+      </w:r>
+    </w:p>
+    <w:p>
+      <w:pPr>
+        <w:spacing w:after="0" w:before="240" w:lineRule="auto"/>
+        <w:rPr/>
+      </w:pPr>
+      <w:r>
+        <w:rPr>
+          <w:rtl w:val="0"/>
+        </w:rPr>
+        <w:t xml:space="preserve">[Completar con documentación relevante en el tiempo para esta actividad]</w:t>
+      </w:r>
+    </w:p>
+    <w:p>
+      <w:pPr>
+        <w:pStyle w:val="Heading3"/>
+        <w:spacing w:before="240" w:lineRule="auto"/>
+        <w:rPr/>
+      </w:pPr>
+      <w:bookmarkStart w:colFirst="0" w:colLast="0" w:name="_8yb64ajtj4af" w:id="17"/>
+      <w:bookmarkEnd w:id="17"/>
+      <w:r>
+        <w:rPr>
+          <w:rtl w:val="0"/>
+        </w:rPr>
+        <w:t xml:space="preserve">Actividad #2: [Completar con nombre]</w:t>
+      </w:r>
+    </w:p>
+    <w:p>
+      <w:pPr>
+        <w:spacing w:before="240" w:lineRule="auto"/>
+        <w:rPr/>
+      </w:pPr>
+      <w:r>
+        <w:rPr>
+          <w:rtl w:val="0"/>
+        </w:rPr>
+        <w:t xml:space="preserve">[Completar con documentación relevante en el tiempo para esta actividad]</w:t>
+      </w:r>
       <w:r>
         <w:rPr>
           <w:rtl w:val="0"/>
@@ -2726,8 +3996,8 @@
               <w:szCs w:val="20"/>
             </w:rPr>
           </w:pPr>
-          <w:bookmarkStart w:colFirst="0" w:colLast="0" w:name="_8ajy0mroiff" w:id="3"/>
-          <w:bookmarkEnd w:id="3"/>
+          <w:bookmarkStart w:colFirst="0" w:colLast="0" w:name="_8ajy0mroiff" w:id="18"/>
+          <w:bookmarkEnd w:id="18"/>
           <w:r>
             <w:rPr>
               <w:sz w:val="20"/>
@@ -2781,6 +4051,224 @@
     <w:lvl w:ilvl="0">
       <w:start w:val="1"/>
       <w:numFmt w:val="bullet"/>
+      <w:lvlText w:val="●"/>
+      <w:lvlJc w:val="left"/>
+      <w:pPr>
+        <w:ind w:left="720" w:hanging="360"/>
+      </w:pPr>
+      <w:rPr>
+        <w:rFonts w:ascii="Arial" w:cs="Arial" w:eastAsia="Arial" w:hAnsi="Arial"/>
+        <w:b w:val="0"/>
+        <w:bCs w:val="0"/>
+        <w:i w:val="0"/>
+        <w:iCs w:val="0"/>
+        <w:smallCaps w:val="0"/>
+        <w:strike w:val="0"/>
+        <w:color w:val="000000"/>
+        <w:sz w:val="22"/>
+        <w:szCs w:val="22"/>
+        <w:u w:val="none"/>
+        <w:shd w:fill="auto" w:val="clear"/>
+        <w:vertAlign w:val="baseline"/>
+      </w:rPr>
+    </w:lvl>
+    <w:lvl w:ilvl="1">
+      <w:start w:val="1"/>
+      <w:numFmt w:val="lowerLetter"/>
+      <w:lvlText w:val="%2."/>
+      <w:lvlJc w:val="left"/>
+      <w:pPr>
+        <w:ind w:left="1440" w:hanging="360"/>
+      </w:pPr>
+      <w:rPr>
+        <w:rFonts w:ascii="Arial" w:cs="Arial" w:eastAsia="Arial" w:hAnsi="Arial"/>
+        <w:b w:val="0"/>
+        <w:bCs w:val="0"/>
+        <w:i w:val="0"/>
+        <w:iCs w:val="0"/>
+        <w:smallCaps w:val="0"/>
+        <w:strike w:val="0"/>
+        <w:color w:val="000000"/>
+        <w:sz w:val="22"/>
+        <w:szCs w:val="22"/>
+        <w:u w:val="none"/>
+        <w:shd w:fill="auto" w:val="clear"/>
+        <w:vertAlign w:val="baseline"/>
+      </w:rPr>
+    </w:lvl>
+    <w:lvl w:ilvl="2">
+      <w:start w:val="1"/>
+      <w:numFmt w:val="lowerRoman"/>
+      <w:lvlText w:val="%3."/>
+      <w:lvlJc w:val="left"/>
+      <w:pPr>
+        <w:ind w:left="2160" w:hanging="360"/>
+      </w:pPr>
+      <w:rPr>
+        <w:rFonts w:ascii="Arial" w:cs="Arial" w:eastAsia="Arial" w:hAnsi="Arial"/>
+        <w:b w:val="0"/>
+        <w:bCs w:val="0"/>
+        <w:i w:val="0"/>
+        <w:iCs w:val="0"/>
+        <w:smallCaps w:val="0"/>
+        <w:strike w:val="0"/>
+        <w:color w:val="000000"/>
+        <w:sz w:val="22"/>
+        <w:szCs w:val="22"/>
+        <w:u w:val="none"/>
+        <w:shd w:fill="auto" w:val="clear"/>
+        <w:vertAlign w:val="baseline"/>
+      </w:rPr>
+    </w:lvl>
+    <w:lvl w:ilvl="3">
+      <w:start w:val="1"/>
+      <w:numFmt w:val="decimal"/>
+      <w:lvlText w:val="%4."/>
+      <w:lvlJc w:val="left"/>
+      <w:pPr>
+        <w:ind w:left="2880" w:hanging="360"/>
+      </w:pPr>
+      <w:rPr>
+        <w:rFonts w:ascii="Arial" w:cs="Arial" w:eastAsia="Arial" w:hAnsi="Arial"/>
+        <w:b w:val="0"/>
+        <w:bCs w:val="0"/>
+        <w:i w:val="0"/>
+        <w:iCs w:val="0"/>
+        <w:smallCaps w:val="0"/>
+        <w:strike w:val="0"/>
+        <w:color w:val="000000"/>
+        <w:sz w:val="22"/>
+        <w:szCs w:val="22"/>
+        <w:u w:val="none"/>
+        <w:shd w:fill="auto" w:val="clear"/>
+        <w:vertAlign w:val="baseline"/>
+      </w:rPr>
+    </w:lvl>
+    <w:lvl w:ilvl="4">
+      <w:start w:val="1"/>
+      <w:numFmt w:val="lowerLetter"/>
+      <w:lvlText w:val="%5."/>
+      <w:lvlJc w:val="left"/>
+      <w:pPr>
+        <w:ind w:left="3600" w:hanging="360"/>
+      </w:pPr>
+      <w:rPr>
+        <w:rFonts w:ascii="Arial" w:cs="Arial" w:eastAsia="Arial" w:hAnsi="Arial"/>
+        <w:b w:val="0"/>
+        <w:bCs w:val="0"/>
+        <w:i w:val="0"/>
+        <w:iCs w:val="0"/>
+        <w:smallCaps w:val="0"/>
+        <w:strike w:val="0"/>
+        <w:color w:val="000000"/>
+        <w:sz w:val="22"/>
+        <w:szCs w:val="22"/>
+        <w:u w:val="none"/>
+        <w:shd w:fill="auto" w:val="clear"/>
+        <w:vertAlign w:val="baseline"/>
+      </w:rPr>
+    </w:lvl>
+    <w:lvl w:ilvl="5">
+      <w:start w:val="1"/>
+      <w:numFmt w:val="lowerRoman"/>
+      <w:lvlText w:val="%6."/>
+      <w:lvlJc w:val="left"/>
+      <w:pPr>
+        <w:ind w:left="4320" w:hanging="360"/>
+      </w:pPr>
+      <w:rPr>
+        <w:rFonts w:ascii="Arial" w:cs="Arial" w:eastAsia="Arial" w:hAnsi="Arial"/>
+        <w:b w:val="0"/>
+        <w:bCs w:val="0"/>
+        <w:i w:val="0"/>
+        <w:iCs w:val="0"/>
+        <w:smallCaps w:val="0"/>
+        <w:strike w:val="0"/>
+        <w:color w:val="000000"/>
+        <w:sz w:val="22"/>
+        <w:szCs w:val="22"/>
+        <w:u w:val="none"/>
+        <w:shd w:fill="auto" w:val="clear"/>
+        <w:vertAlign w:val="baseline"/>
+      </w:rPr>
+    </w:lvl>
+    <w:lvl w:ilvl="6">
+      <w:start w:val="1"/>
+      <w:numFmt w:val="decimal"/>
+      <w:lvlText w:val="%7."/>
+      <w:lvlJc w:val="left"/>
+      <w:pPr>
+        <w:ind w:left="5040" w:hanging="360"/>
+      </w:pPr>
+      <w:rPr>
+        <w:rFonts w:ascii="Arial" w:cs="Arial" w:eastAsia="Arial" w:hAnsi="Arial"/>
+        <w:b w:val="0"/>
+        <w:bCs w:val="0"/>
+        <w:i w:val="0"/>
+        <w:iCs w:val="0"/>
+        <w:smallCaps w:val="0"/>
+        <w:strike w:val="0"/>
+        <w:color w:val="000000"/>
+        <w:sz w:val="22"/>
+        <w:szCs w:val="22"/>
+        <w:u w:val="none"/>
+        <w:shd w:fill="auto" w:val="clear"/>
+        <w:vertAlign w:val="baseline"/>
+      </w:rPr>
+    </w:lvl>
+    <w:lvl w:ilvl="7">
+      <w:start w:val="1"/>
+      <w:numFmt w:val="lowerLetter"/>
+      <w:lvlText w:val="%8."/>
+      <w:lvlJc w:val="left"/>
+      <w:pPr>
+        <w:ind w:left="5760" w:hanging="360"/>
+      </w:pPr>
+      <w:rPr>
+        <w:rFonts w:ascii="Arial" w:cs="Arial" w:eastAsia="Arial" w:hAnsi="Arial"/>
+        <w:b w:val="0"/>
+        <w:bCs w:val="0"/>
+        <w:i w:val="0"/>
+        <w:iCs w:val="0"/>
+        <w:smallCaps w:val="0"/>
+        <w:strike w:val="0"/>
+        <w:color w:val="000000"/>
+        <w:sz w:val="22"/>
+        <w:szCs w:val="22"/>
+        <w:u w:val="none"/>
+        <w:shd w:fill="auto" w:val="clear"/>
+        <w:vertAlign w:val="baseline"/>
+      </w:rPr>
+    </w:lvl>
+    <w:lvl w:ilvl="8">
+      <w:start w:val="1"/>
+      <w:numFmt w:val="lowerRoman"/>
+      <w:lvlText w:val="%9."/>
+      <w:lvlJc w:val="left"/>
+      <w:pPr>
+        <w:ind w:left="6480" w:hanging="360"/>
+      </w:pPr>
+      <w:rPr>
+        <w:rFonts w:ascii="Arial" w:cs="Arial" w:eastAsia="Arial" w:hAnsi="Arial"/>
+        <w:b w:val="0"/>
+        <w:bCs w:val="0"/>
+        <w:i w:val="0"/>
+        <w:iCs w:val="0"/>
+        <w:smallCaps w:val="0"/>
+        <w:strike w:val="0"/>
+        <w:color w:val="000000"/>
+        <w:sz w:val="22"/>
+        <w:szCs w:val="22"/>
+        <w:u w:val="none"/>
+        <w:shd w:fill="auto" w:val="clear"/>
+        <w:vertAlign w:val="baseline"/>
+      </w:rPr>
+    </w:lvl>
+  </w:abstractNum>
+  <w:abstractNum w:abstractNumId="2">
+    <w:lvl w:ilvl="0">
+      <w:start w:val="1"/>
+      <w:numFmt w:val="bullet"/>
       <w:lvlText w:val="•"/>
       <w:lvlJc w:val="left"/>
       <w:pPr>
@@ -2874,8 +4362,124 @@
       <w:rPr/>
     </w:lvl>
   </w:abstractNum>
+  <w:abstractNum w:abstractNumId="3">
+    <w:lvl w:ilvl="0">
+      <w:start w:val="1"/>
+      <w:numFmt w:val="bullet"/>
+      <w:lvlText w:val="●"/>
+      <w:lvlJc w:val="left"/>
+      <w:pPr>
+        <w:ind w:left="720" w:hanging="360"/>
+      </w:pPr>
+      <w:rPr>
+        <w:u w:val="none"/>
+      </w:rPr>
+    </w:lvl>
+    <w:lvl w:ilvl="1">
+      <w:start w:val="1"/>
+      <w:numFmt w:val="bullet"/>
+      <w:lvlText w:val="○"/>
+      <w:lvlJc w:val="left"/>
+      <w:pPr>
+        <w:ind w:left="1440" w:hanging="360"/>
+      </w:pPr>
+      <w:rPr>
+        <w:u w:val="none"/>
+      </w:rPr>
+    </w:lvl>
+    <w:lvl w:ilvl="2">
+      <w:start w:val="1"/>
+      <w:numFmt w:val="bullet"/>
+      <w:lvlText w:val="■"/>
+      <w:lvlJc w:val="left"/>
+      <w:pPr>
+        <w:ind w:left="2160" w:hanging="360"/>
+      </w:pPr>
+      <w:rPr>
+        <w:u w:val="none"/>
+      </w:rPr>
+    </w:lvl>
+    <w:lvl w:ilvl="3">
+      <w:start w:val="1"/>
+      <w:numFmt w:val="bullet"/>
+      <w:lvlText w:val="●"/>
+      <w:lvlJc w:val="left"/>
+      <w:pPr>
+        <w:ind w:left="2880" w:hanging="360"/>
+      </w:pPr>
+      <w:rPr>
+        <w:u w:val="none"/>
+      </w:rPr>
+    </w:lvl>
+    <w:lvl w:ilvl="4">
+      <w:start w:val="1"/>
+      <w:numFmt w:val="bullet"/>
+      <w:lvlText w:val="○"/>
+      <w:lvlJc w:val="left"/>
+      <w:pPr>
+        <w:ind w:left="3600" w:hanging="360"/>
+      </w:pPr>
+      <w:rPr>
+        <w:u w:val="none"/>
+      </w:rPr>
+    </w:lvl>
+    <w:lvl w:ilvl="5">
+      <w:start w:val="1"/>
+      <w:numFmt w:val="bullet"/>
+      <w:lvlText w:val="■"/>
+      <w:lvlJc w:val="left"/>
+      <w:pPr>
+        <w:ind w:left="4320" w:hanging="360"/>
+      </w:pPr>
+      <w:rPr>
+        <w:u w:val="none"/>
+      </w:rPr>
+    </w:lvl>
+    <w:lvl w:ilvl="6">
+      <w:start w:val="1"/>
+      <w:numFmt w:val="bullet"/>
+      <w:lvlText w:val="●"/>
+      <w:lvlJc w:val="left"/>
+      <w:pPr>
+        <w:ind w:left="5040" w:hanging="360"/>
+      </w:pPr>
+      <w:rPr>
+        <w:u w:val="none"/>
+      </w:rPr>
+    </w:lvl>
+    <w:lvl w:ilvl="7">
+      <w:start w:val="1"/>
+      <w:numFmt w:val="bullet"/>
+      <w:lvlText w:val="○"/>
+      <w:lvlJc w:val="left"/>
+      <w:pPr>
+        <w:ind w:left="5760" w:hanging="360"/>
+      </w:pPr>
+      <w:rPr>
+        <w:u w:val="none"/>
+      </w:rPr>
+    </w:lvl>
+    <w:lvl w:ilvl="8">
+      <w:start w:val="1"/>
+      <w:numFmt w:val="bullet"/>
+      <w:lvlText w:val="■"/>
+      <w:lvlJc w:val="left"/>
+      <w:pPr>
+        <w:ind w:left="6480" w:hanging="360"/>
+      </w:pPr>
+      <w:rPr>
+        <w:u w:val="none"/>
+      </w:rPr>
+    </w:lvl>
+  </w:abstractNum>
   <w:num w:numId="1">
     <w:abstractNumId w:val="1"/>
+  </w:num>
+  <w:num w:numId="2">
+    <w:abstractNumId w:val="2"/>
+  </w:num>
+  <w:num w:numId="3">
+    <w:abstractNumId w:val="3"/>
   </w:num>
 </w:numbering>
 </file>

</xml_diff>